<commit_message>
fix(assignments): restore multiple warehouses and release v1.0.4
</commit_message>
<xml_diff>
--- a/Documentation/Reports/BaoCaoCoSoDuLieu.docx
+++ b/Documentation/Reports/BaoCaoCoSoDuLieu.docx
@@ -9771,7 +9771,7 @@
                 <w:rFonts w:ascii="Times New Roman" w:hAnsi="Times New Roman" w:cs="Times New Roman"/>
                 <w:sz w:val="21"/>
               </w:rPr>
-              <w:t>Mỗi nhân viên chỉ làm việc tại một kho được phân công còn hiệu lực; lập và sửa phiếu theo quyền; không được duyệt hoặc hoàn tất phiếu.</w:t>
+              <w:t>Nhân viên có thể được phân công nhiều kho, nhưng mỗi phiên chỉ làm việc tại một kho được chọn còn hiệu lực; lập và sửa phiếu theo quyền; không được duyệt hoặc hoàn tất phiếu.</w:t>
             </w:r>
           </w:p>
         </w:tc>
@@ -10265,14 +10265,14 @@
         <w:rPr>
           <w:rFonts w:ascii="Times New Roman" w:hAnsi="Times New Roman" w:cs="Times New Roman"/>
         </w:rPr>
-        <w:t xml:space="preserve">Sơ đồ thể hiện các thực thể và mối liên hệ nghiệp vụ theo mô tả bài toán của nhóm. Mỗi bảng có cột ký hiệu PK/FK bên trái, tên thuộc tính bên phải; khóa chính được in đậm và gạch chân. Quan hệ dùng ký hiệu chân quạ: gạch đứng chỉ một, chân quạ chỉ nhiều, vòng tròn chỉ khả năng không có liên kết. Các tham chiếu bổ sung về người gửi duyệt, người </w:t>
+        <w:t xml:space="preserve">Sơ đồ thể hiện các thực thể và mối liên hệ nghiệp vụ theo mô tả bài toán của nhóm. Mỗi bảng có cột ký hiệu PK/FK bên trái, tên thuộc tính bên phải; khóa chính được in đậm và gạch chân. Quan hệ dùng ký hiệu chân quạ: gạch đứng chỉ một, chân quạ chỉ nhiều, vòng </w:t>
       </w:r>
       <w:r>
         <w:rPr>
           <w:rFonts w:ascii="Times New Roman" w:hAnsi="Times New Roman" w:cs="Times New Roman"/>
         </w:rPr>
         <w:lastRenderedPageBreak/>
-        <w:t>duyệt, người hoàn tất, người hủy và người ghi lịch sử được trình bày trong bảng entity ở mục 2.3.1.</w:t>
+        <w:t>tròn chỉ khả năng không có liên kết. Các tham chiếu bổ sung về người gửi duyệt, người duyệt, người hoàn tất, người hủy và người ghi lịch sử được trình bày trong bảng entity ở mục 2.3.1.</w:t>
       </w:r>
     </w:p>
     <w:p>
@@ -10630,7 +10630,7 @@
           <w:rFonts w:ascii="Times New Roman" w:hAnsi="Times New Roman" w:cs="Times New Roman"/>
         </w:rPr>
         <w:lastRenderedPageBreak/>
-        <w:t>UserWarehouse liên kết người dùng với kho bằng khóa ghép (UserId, WarehouseId). Mỗi nhân viên chỉ có một phân công đang hoạt động. Khi đổi kho, phân công cũ được giữ lại với IsActive bằng false. Người quản lý kho được xác định qua Warehouse.ManagerId và có thể phụ trách nhiều kho. Inventory lưu số lượng hiện có, còn InventoryTransaction ghi lại những lần thay đổi số lượng của từng sản phẩm tại từng kho.</w:t>
+        <w:t>UserWarehouse liên kết người dùng với kho bằng khóa ghép (UserId, WarehouseId). Một nhân viên có thể có nhiều phân công đang hoạt động. Khi thu hồi một phân công, dòng tương ứng được giữ lại với IsActive bằng false; các phân công khác không thay đổi. Người quản lý kho được xác định qua Warehouse.ManagerId và có thể phụ trách nhiều kho. Inventory lưu số lượng hiện có, còn InventoryTransaction ghi lại những lần thay đổi số lượng của từng sản phẩm tại từng kho.</w:t>
       </w:r>
     </w:p>
     <w:p>
@@ -12308,7 +12308,7 @@
         <w:rPr>
           <w:rFonts w:ascii="Times New Roman" w:hAnsi="Times New Roman" w:cs="Times New Roman"/>
         </w:rPr>
-        <w:t>Ghi nhận phân công nhân viên theo kho. Mỗi nhân viên chỉ có một phân công còn hiệu lực; các phân công cũ được giữ lại với trạng thái ngừng hoạt động.</w:t>
+        <w:t>Ghi nhận phân công nhân viên theo kho. Một nhân viên có thể được phân công nhiều kho; mỗi cặp người dùng và kho chỉ có một bản ghi. Phân công đã thu hồi được giữ lại với trạng thái ngừng hoạt động.</w:t>
       </w:r>
     </w:p>
     <w:tbl>

</xml_diff>